<commit_message>
Rediseño de vista Clientes con CRUD completo
</commit_message>
<xml_diff>
--- a/TallerPro/Documentation/Documentation(TallerPro).docx
+++ b/TallerPro/Documentation/Documentation(TallerPro).docx
@@ -5,6 +5,7 @@
     <w:p>
       <w:pPr>
         <w:rPr>
+          <w:rFonts w:ascii="Arial" w:hAnsi="Arial" w:cs="Arial"/>
           <w:b/>
           <w:bCs/>
           <w:sz w:val="28"/>
@@ -13,6 +14,7 @@
       </w:pPr>
       <w:r>
         <w:rPr>
+          <w:rFonts w:ascii="Arial" w:hAnsi="Arial" w:cs="Arial"/>
           <w:b/>
           <w:bCs/>
           <w:sz w:val="28"/>
@@ -23,6 +25,7 @@
       <w:proofErr w:type="spellStart"/>
       <w:r>
         <w:rPr>
+          <w:rFonts w:ascii="Arial" w:hAnsi="Arial" w:cs="Arial"/>
           <w:b/>
           <w:bCs/>
           <w:sz w:val="28"/>
@@ -33,41 +36,26 @@
       <w:proofErr w:type="spellEnd"/>
       <w:r>
         <w:rPr>
+          <w:rFonts w:ascii="Arial" w:hAnsi="Arial" w:cs="Arial"/>
           <w:b/>
           <w:bCs/>
           <w:sz w:val="28"/>
           <w:szCs w:val="28"/>
         </w:rPr>
-        <w:t xml:space="preserve"> -</w:t>
-      </w:r>
-      <w:r>
-        <w:rPr>
-          <w:b/>
-          <w:bCs/>
-          <w:sz w:val="28"/>
-          <w:szCs w:val="28"/>
-        </w:rPr>
-        <w:t xml:space="preserve"> </w:t>
-      </w:r>
-      <w:r>
-        <w:rPr>
-          <w:b/>
-          <w:bCs/>
-          <w:sz w:val="28"/>
-          <w:szCs w:val="28"/>
-        </w:rPr>
-        <w:t>(07/09/2026)</w:t>
-      </w:r>
-    </w:p>
-    <w:p>
-      <w:pPr>
-        <w:rPr>
-          <w:b/>
-          <w:bCs/>
-        </w:rPr>
-      </w:pPr>
-      <w:r>
-        <w:rPr>
+        <w:t xml:space="preserve"> - (07/09/2026)</w:t>
+      </w:r>
+    </w:p>
+    <w:p>
+      <w:pPr>
+        <w:rPr>
+          <w:rFonts w:ascii="Arial" w:hAnsi="Arial" w:cs="Arial"/>
+          <w:b/>
+          <w:bCs/>
+        </w:rPr>
+      </w:pPr>
+      <w:r>
+        <w:rPr>
+          <w:rFonts w:ascii="Arial" w:hAnsi="Arial" w:cs="Arial"/>
           <w:b/>
           <w:bCs/>
         </w:rPr>
@@ -75,38 +63,42 @@
       </w:r>
     </w:p>
     <w:p>
-      <w:r>
+      <w:pPr>
+        <w:rPr>
+          <w:rFonts w:ascii="Arial" w:hAnsi="Arial" w:cs="Arial"/>
+        </w:rPr>
+      </w:pPr>
+      <w:r>
+        <w:rPr>
+          <w:rFonts w:ascii="Arial" w:hAnsi="Arial" w:cs="Arial"/>
+        </w:rPr>
         <w:t>El proyecto busca crear un sistema de gestión para un taller de reparación de equipos. La meta es organizar la información de clientes, equipos, órdenes de reparación y facturación, asegurando un flujo claro y controlado de datos.</w:t>
       </w:r>
     </w:p>
     <w:p>
       <w:pPr>
         <w:rPr>
-          <w:b/>
-          <w:bCs/>
-        </w:rPr>
-      </w:pPr>
-    </w:p>
-    <w:p>
-      <w:pPr>
-        <w:rPr>
-          <w:b/>
-          <w:bCs/>
-        </w:rPr>
-      </w:pPr>
-      <w:r>
-        <w:rPr>
-          <w:b/>
-          <w:bCs/>
-        </w:rPr>
-        <w:t>1</w:t>
-      </w:r>
-      <w:r>
-        <w:rPr>
-          <w:b/>
-          <w:bCs/>
-        </w:rPr>
-        <w:t>. Diseño de Base de Datos</w:t>
+          <w:rFonts w:ascii="Arial" w:hAnsi="Arial" w:cs="Arial"/>
+          <w:b/>
+          <w:bCs/>
+        </w:rPr>
+      </w:pPr>
+    </w:p>
+    <w:p>
+      <w:pPr>
+        <w:rPr>
+          <w:rFonts w:ascii="Arial" w:hAnsi="Arial" w:cs="Arial"/>
+          <w:b/>
+          <w:bCs/>
+        </w:rPr>
+      </w:pPr>
+      <w:r>
+        <w:rPr>
+          <w:rFonts w:ascii="Arial" w:hAnsi="Arial" w:cs="Arial"/>
+          <w:b/>
+          <w:bCs/>
+        </w:rPr>
+        <w:t>1. Diseño de Base de Datos</w:t>
       </w:r>
     </w:p>
     <w:tbl>
@@ -146,12 +138,14 @@
           <w:p>
             <w:pPr>
               <w:rPr>
+                <w:rFonts w:ascii="Arial" w:hAnsi="Arial" w:cs="Arial"/>
                 <w:b/>
                 <w:bCs/>
               </w:rPr>
             </w:pPr>
             <w:r>
               <w:rPr>
+                <w:rFonts w:ascii="Arial" w:hAnsi="Arial" w:cs="Arial"/>
                 <w:b/>
                 <w:bCs/>
               </w:rPr>
@@ -172,12 +166,14 @@
           <w:p>
             <w:pPr>
               <w:rPr>
+                <w:rFonts w:ascii="Arial" w:hAnsi="Arial" w:cs="Arial"/>
                 <w:b/>
                 <w:bCs/>
               </w:rPr>
             </w:pPr>
             <w:r>
               <w:rPr>
+                <w:rFonts w:ascii="Arial" w:hAnsi="Arial" w:cs="Arial"/>
                 <w:b/>
                 <w:bCs/>
               </w:rPr>
@@ -199,12 +195,14 @@
           <w:p>
             <w:pPr>
               <w:rPr>
+                <w:rFonts w:ascii="Arial" w:hAnsi="Arial" w:cs="Arial"/>
                 <w:b/>
                 <w:bCs/>
               </w:rPr>
             </w:pPr>
             <w:r>
               <w:rPr>
+                <w:rFonts w:ascii="Arial" w:hAnsi="Arial" w:cs="Arial"/>
                 <w:b/>
                 <w:bCs/>
               </w:rPr>
@@ -225,12 +223,14 @@
           <w:p>
             <w:pPr>
               <w:rPr>
+                <w:rFonts w:ascii="Arial" w:hAnsi="Arial" w:cs="Arial"/>
                 <w:b/>
                 <w:bCs/>
               </w:rPr>
             </w:pPr>
             <w:r>
               <w:rPr>
+                <w:rFonts w:ascii="Arial" w:hAnsi="Arial" w:cs="Arial"/>
                 <w:b/>
                 <w:bCs/>
               </w:rPr>
@@ -257,12 +257,14 @@
           <w:p>
             <w:pPr>
               <w:rPr>
+                <w:rFonts w:ascii="Arial" w:hAnsi="Arial" w:cs="Arial"/>
                 <w:b/>
                 <w:bCs/>
               </w:rPr>
             </w:pPr>
             <w:r>
               <w:rPr>
+                <w:rFonts w:ascii="Arial" w:hAnsi="Arial" w:cs="Arial"/>
                 <w:b/>
                 <w:bCs/>
               </w:rPr>
@@ -284,12 +286,14 @@
           <w:p>
             <w:pPr>
               <w:rPr>
+                <w:rFonts w:ascii="Arial" w:hAnsi="Arial" w:cs="Arial"/>
                 <w:b/>
                 <w:bCs/>
               </w:rPr>
             </w:pPr>
             <w:r>
               <w:rPr>
+                <w:rFonts w:ascii="Arial" w:hAnsi="Arial" w:cs="Arial"/>
                 <w:b/>
                 <w:bCs/>
               </w:rPr>
@@ -310,7 +314,15 @@
             <w:hideMark/>
           </w:tcPr>
           <w:p>
+            <w:pPr>
+              <w:rPr>
+                <w:rFonts w:ascii="Arial" w:hAnsi="Arial" w:cs="Arial"/>
+              </w:rPr>
+            </w:pPr>
             <w:r>
+              <w:rPr>
+                <w:rFonts w:ascii="Arial" w:hAnsi="Arial" w:cs="Arial"/>
+              </w:rPr>
               <w:t>Almacena los datos de los clientes.</w:t>
             </w:r>
           </w:p>
@@ -327,32 +339,20 @@
             <w:hideMark/>
           </w:tcPr>
           <w:p>
+            <w:pPr>
+              <w:rPr>
+                <w:rFonts w:ascii="Arial" w:hAnsi="Arial" w:cs="Arial"/>
+              </w:rPr>
+            </w:pPr>
             <w:r>
-              <w:t>1</w:t>
+              <w:rPr>
+                <w:rFonts w:ascii="Arial" w:hAnsi="Arial" w:cs="Arial"/>
+              </w:rPr>
+              <w:t xml:space="preserve">1 → N con </w:t>
             </w:r>
             <w:r>
               <w:rPr>
                 <w:rFonts w:ascii="Arial" w:hAnsi="Arial" w:cs="Arial"/>
-              </w:rPr>
-              <w:t> </w:t>
-            </w:r>
-            <w:r>
-              <w:rPr>
-                <w:rFonts w:ascii="Aptos" w:hAnsi="Aptos" w:cs="Aptos"/>
-              </w:rPr>
-              <w:t>→</w:t>
-            </w:r>
-            <w:r>
-              <w:rPr>
-                <w:rFonts w:ascii="Arial" w:hAnsi="Arial" w:cs="Arial"/>
-              </w:rPr>
-              <w:t> </w:t>
-            </w:r>
-            <w:r>
-              <w:t xml:space="preserve">N con </w:t>
-            </w:r>
-            <w:r>
-              <w:rPr>
                 <w:i/>
                 <w:iCs/>
               </w:rPr>
@@ -377,12 +377,14 @@
           <w:p>
             <w:pPr>
               <w:rPr>
+                <w:rFonts w:ascii="Arial" w:hAnsi="Arial" w:cs="Arial"/>
                 <w:b/>
                 <w:bCs/>
               </w:rPr>
             </w:pPr>
             <w:r>
               <w:rPr>
+                <w:rFonts w:ascii="Arial" w:hAnsi="Arial" w:cs="Arial"/>
                 <w:b/>
                 <w:bCs/>
               </w:rPr>
@@ -402,12 +404,14 @@
           <w:p>
             <w:pPr>
               <w:rPr>
+                <w:rFonts w:ascii="Arial" w:hAnsi="Arial" w:cs="Arial"/>
                 <w:b/>
                 <w:bCs/>
               </w:rPr>
             </w:pPr>
             <w:r>
               <w:rPr>
+                <w:rFonts w:ascii="Arial" w:hAnsi="Arial" w:cs="Arial"/>
                 <w:b/>
                 <w:bCs/>
               </w:rPr>
@@ -426,7 +430,15 @@
             <w:hideMark/>
           </w:tcPr>
           <w:p>
+            <w:pPr>
+              <w:rPr>
+                <w:rFonts w:ascii="Arial" w:hAnsi="Arial" w:cs="Arial"/>
+              </w:rPr>
+            </w:pPr>
             <w:r>
+              <w:rPr>
+                <w:rFonts w:ascii="Arial" w:hAnsi="Arial" w:cs="Arial"/>
+              </w:rPr>
               <w:t>Registra los equipos asociados a cada cliente.</w:t>
             </w:r>
           </w:p>
@@ -441,32 +453,20 @@
             <w:hideMark/>
           </w:tcPr>
           <w:p>
+            <w:pPr>
+              <w:rPr>
+                <w:rFonts w:ascii="Arial" w:hAnsi="Arial" w:cs="Arial"/>
+              </w:rPr>
+            </w:pPr>
             <w:r>
-              <w:t>N</w:t>
+              <w:rPr>
+                <w:rFonts w:ascii="Arial" w:hAnsi="Arial" w:cs="Arial"/>
+              </w:rPr>
+              <w:t xml:space="preserve">N → 1 con </w:t>
             </w:r>
             <w:r>
               <w:rPr>
                 <w:rFonts w:ascii="Arial" w:hAnsi="Arial" w:cs="Arial"/>
-              </w:rPr>
-              <w:t> </w:t>
-            </w:r>
-            <w:r>
-              <w:rPr>
-                <w:rFonts w:ascii="Aptos" w:hAnsi="Aptos" w:cs="Aptos"/>
-              </w:rPr>
-              <w:t>→</w:t>
-            </w:r>
-            <w:r>
-              <w:rPr>
-                <w:rFonts w:ascii="Arial" w:hAnsi="Arial" w:cs="Arial"/>
-              </w:rPr>
-              <w:t> </w:t>
-            </w:r>
-            <w:r>
-              <w:t xml:space="preserve">1 con </w:t>
-            </w:r>
-            <w:r>
-              <w:rPr>
                 <w:i/>
                 <w:iCs/>
               </w:rPr>
@@ -493,12 +493,14 @@
           <w:p>
             <w:pPr>
               <w:rPr>
+                <w:rFonts w:ascii="Arial" w:hAnsi="Arial" w:cs="Arial"/>
                 <w:b/>
                 <w:bCs/>
               </w:rPr>
             </w:pPr>
             <w:r>
               <w:rPr>
+                <w:rFonts w:ascii="Arial" w:hAnsi="Arial" w:cs="Arial"/>
                 <w:b/>
                 <w:bCs/>
               </w:rPr>
@@ -520,12 +522,14 @@
           <w:p>
             <w:pPr>
               <w:rPr>
+                <w:rFonts w:ascii="Arial" w:hAnsi="Arial" w:cs="Arial"/>
                 <w:b/>
                 <w:bCs/>
               </w:rPr>
             </w:pPr>
             <w:r>
               <w:rPr>
+                <w:rFonts w:ascii="Arial" w:hAnsi="Arial" w:cs="Arial"/>
                 <w:b/>
                 <w:bCs/>
               </w:rPr>
@@ -546,7 +550,15 @@
             <w:hideMark/>
           </w:tcPr>
           <w:p>
+            <w:pPr>
+              <w:rPr>
+                <w:rFonts w:ascii="Arial" w:hAnsi="Arial" w:cs="Arial"/>
+              </w:rPr>
+            </w:pPr>
             <w:r>
+              <w:rPr>
+                <w:rFonts w:ascii="Arial" w:hAnsi="Arial" w:cs="Arial"/>
+              </w:rPr>
               <w:t>Tabla central del sistema; gestiona las reparaciones.</w:t>
             </w:r>
           </w:p>
@@ -563,42 +575,34 @@
             <w:hideMark/>
           </w:tcPr>
           <w:p>
+            <w:pPr>
+              <w:rPr>
+                <w:rFonts w:ascii="Arial" w:hAnsi="Arial" w:cs="Arial"/>
+              </w:rPr>
+            </w:pPr>
             <w:r>
-              <w:t>N</w:t>
+              <w:rPr>
+                <w:rFonts w:ascii="Arial" w:hAnsi="Arial" w:cs="Arial"/>
+              </w:rPr>
+              <w:t xml:space="preserve">N → 1 con </w:t>
             </w:r>
             <w:r>
               <w:rPr>
                 <w:rFonts w:ascii="Arial" w:hAnsi="Arial" w:cs="Arial"/>
-              </w:rPr>
-              <w:t> </w:t>
-            </w:r>
-            <w:r>
-              <w:rPr>
-                <w:rFonts w:ascii="Aptos" w:hAnsi="Aptos" w:cs="Aptos"/>
-              </w:rPr>
-              <w:t>→</w:t>
-            </w:r>
-            <w:r>
-              <w:rPr>
-                <w:rFonts w:ascii="Arial" w:hAnsi="Arial" w:cs="Arial"/>
-              </w:rPr>
-              <w:t> </w:t>
-            </w:r>
-            <w:r>
-              <w:t xml:space="preserve">1 con </w:t>
-            </w:r>
-            <w:r>
-              <w:rPr>
                 <w:i/>
                 <w:iCs/>
               </w:rPr>
               <w:t>Equipos</w:t>
             </w:r>
             <w:r>
+              <w:rPr>
+                <w:rFonts w:ascii="Arial" w:hAnsi="Arial" w:cs="Arial"/>
+              </w:rPr>
               <w:t xml:space="preserve"> y </w:t>
             </w:r>
             <w:r>
               <w:rPr>
+                <w:rFonts w:ascii="Arial" w:hAnsi="Arial" w:cs="Arial"/>
                 <w:i/>
                 <w:iCs/>
               </w:rPr>
@@ -624,12 +628,14 @@
           <w:p>
             <w:pPr>
               <w:rPr>
+                <w:rFonts w:ascii="Arial" w:hAnsi="Arial" w:cs="Arial"/>
                 <w:b/>
                 <w:bCs/>
               </w:rPr>
             </w:pPr>
             <w:r>
               <w:rPr>
+                <w:rFonts w:ascii="Arial" w:hAnsi="Arial" w:cs="Arial"/>
                 <w:b/>
                 <w:bCs/>
               </w:rPr>
@@ -650,12 +656,14 @@
           <w:p>
             <w:pPr>
               <w:rPr>
+                <w:rFonts w:ascii="Arial" w:hAnsi="Arial" w:cs="Arial"/>
                 <w:b/>
                 <w:bCs/>
               </w:rPr>
             </w:pPr>
             <w:r>
               <w:rPr>
+                <w:rFonts w:ascii="Arial" w:hAnsi="Arial" w:cs="Arial"/>
                 <w:b/>
                 <w:bCs/>
               </w:rPr>
@@ -675,7 +683,15 @@
             <w:hideMark/>
           </w:tcPr>
           <w:p>
+            <w:pPr>
+              <w:rPr>
+                <w:rFonts w:ascii="Arial" w:hAnsi="Arial" w:cs="Arial"/>
+              </w:rPr>
+            </w:pPr>
             <w:r>
+              <w:rPr>
+                <w:rFonts w:ascii="Arial" w:hAnsi="Arial" w:cs="Arial"/>
+              </w:rPr>
               <w:t>Define los estados del proceso de reparación.</w:t>
             </w:r>
           </w:p>
@@ -691,32 +707,20 @@
             <w:hideMark/>
           </w:tcPr>
           <w:p>
+            <w:pPr>
+              <w:rPr>
+                <w:rFonts w:ascii="Arial" w:hAnsi="Arial" w:cs="Arial"/>
+              </w:rPr>
+            </w:pPr>
             <w:r>
-              <w:t>1</w:t>
+              <w:rPr>
+                <w:rFonts w:ascii="Arial" w:hAnsi="Arial" w:cs="Arial"/>
+              </w:rPr>
+              <w:t xml:space="preserve">1 → N con </w:t>
             </w:r>
             <w:r>
               <w:rPr>
                 <w:rFonts w:ascii="Arial" w:hAnsi="Arial" w:cs="Arial"/>
-              </w:rPr>
-              <w:t> </w:t>
-            </w:r>
-            <w:r>
-              <w:rPr>
-                <w:rFonts w:ascii="Aptos" w:hAnsi="Aptos" w:cs="Aptos"/>
-              </w:rPr>
-              <w:t>→</w:t>
-            </w:r>
-            <w:r>
-              <w:rPr>
-                <w:rFonts w:ascii="Arial" w:hAnsi="Arial" w:cs="Arial"/>
-              </w:rPr>
-              <w:t> </w:t>
-            </w:r>
-            <w:r>
-              <w:t xml:space="preserve">N con </w:t>
-            </w:r>
-            <w:r>
-              <w:rPr>
                 <w:i/>
                 <w:iCs/>
               </w:rPr>
@@ -741,12 +745,14 @@
           <w:p>
             <w:pPr>
               <w:rPr>
+                <w:rFonts w:ascii="Arial" w:hAnsi="Arial" w:cs="Arial"/>
                 <w:b/>
                 <w:bCs/>
               </w:rPr>
             </w:pPr>
             <w:r>
               <w:rPr>
+                <w:rFonts w:ascii="Arial" w:hAnsi="Arial" w:cs="Arial"/>
                 <w:b/>
                 <w:bCs/>
               </w:rPr>
@@ -766,12 +772,14 @@
           <w:p>
             <w:pPr>
               <w:rPr>
+                <w:rFonts w:ascii="Arial" w:hAnsi="Arial" w:cs="Arial"/>
                 <w:b/>
                 <w:bCs/>
               </w:rPr>
             </w:pPr>
             <w:r>
               <w:rPr>
+                <w:rFonts w:ascii="Arial" w:hAnsi="Arial" w:cs="Arial"/>
                 <w:b/>
                 <w:bCs/>
               </w:rPr>
@@ -790,7 +798,15 @@
             <w:hideMark/>
           </w:tcPr>
           <w:p>
+            <w:pPr>
+              <w:rPr>
+                <w:rFonts w:ascii="Arial" w:hAnsi="Arial" w:cs="Arial"/>
+              </w:rPr>
+            </w:pPr>
             <w:r>
+              <w:rPr>
+                <w:rFonts w:ascii="Arial" w:hAnsi="Arial" w:cs="Arial"/>
+              </w:rPr>
               <w:t>Registra la facturación de cada orden.</w:t>
             </w:r>
           </w:p>
@@ -805,32 +821,20 @@
             <w:hideMark/>
           </w:tcPr>
           <w:p>
+            <w:pPr>
+              <w:rPr>
+                <w:rFonts w:ascii="Arial" w:hAnsi="Arial" w:cs="Arial"/>
+              </w:rPr>
+            </w:pPr>
             <w:r>
-              <w:t>1</w:t>
+              <w:rPr>
+                <w:rFonts w:ascii="Arial" w:hAnsi="Arial" w:cs="Arial"/>
+              </w:rPr>
+              <w:t xml:space="preserve">1 → 1 con </w:t>
             </w:r>
             <w:r>
               <w:rPr>
                 <w:rFonts w:ascii="Arial" w:hAnsi="Arial" w:cs="Arial"/>
-              </w:rPr>
-              <w:t> </w:t>
-            </w:r>
-            <w:r>
-              <w:rPr>
-                <w:rFonts w:ascii="Aptos" w:hAnsi="Aptos" w:cs="Aptos"/>
-              </w:rPr>
-              <w:t>→</w:t>
-            </w:r>
-            <w:r>
-              <w:rPr>
-                <w:rFonts w:ascii="Arial" w:hAnsi="Arial" w:cs="Arial"/>
-              </w:rPr>
-              <w:t> </w:t>
-            </w:r>
-            <w:r>
-              <w:t xml:space="preserve">1 con </w:t>
-            </w:r>
-            <w:r>
-              <w:rPr>
                 <w:i/>
                 <w:iCs/>
               </w:rPr>
@@ -857,12 +861,14 @@
           <w:p>
             <w:pPr>
               <w:rPr>
+                <w:rFonts w:ascii="Arial" w:hAnsi="Arial" w:cs="Arial"/>
                 <w:b/>
                 <w:bCs/>
               </w:rPr>
             </w:pPr>
             <w:r>
               <w:rPr>
+                <w:rFonts w:ascii="Arial" w:hAnsi="Arial" w:cs="Arial"/>
                 <w:b/>
                 <w:bCs/>
               </w:rPr>
@@ -884,12 +890,14 @@
           <w:p>
             <w:pPr>
               <w:rPr>
+                <w:rFonts w:ascii="Arial" w:hAnsi="Arial" w:cs="Arial"/>
                 <w:b/>
                 <w:bCs/>
               </w:rPr>
             </w:pPr>
             <w:r>
               <w:rPr>
+                <w:rFonts w:ascii="Arial" w:hAnsi="Arial" w:cs="Arial"/>
                 <w:b/>
                 <w:bCs/>
               </w:rPr>
@@ -910,7 +918,15 @@
             <w:hideMark/>
           </w:tcPr>
           <w:p>
+            <w:pPr>
+              <w:rPr>
+                <w:rFonts w:ascii="Arial" w:hAnsi="Arial" w:cs="Arial"/>
+              </w:rPr>
+            </w:pPr>
             <w:r>
+              <w:rPr>
+                <w:rFonts w:ascii="Arial" w:hAnsi="Arial" w:cs="Arial"/>
+              </w:rPr>
               <w:t>Detalla los conceptos de cada factura.</w:t>
             </w:r>
           </w:p>
@@ -927,32 +943,20 @@
             <w:hideMark/>
           </w:tcPr>
           <w:p>
+            <w:pPr>
+              <w:rPr>
+                <w:rFonts w:ascii="Arial" w:hAnsi="Arial" w:cs="Arial"/>
+              </w:rPr>
+            </w:pPr>
             <w:r>
-              <w:t>1</w:t>
+              <w:rPr>
+                <w:rFonts w:ascii="Arial" w:hAnsi="Arial" w:cs="Arial"/>
+              </w:rPr>
+              <w:t xml:space="preserve">1 → N con </w:t>
             </w:r>
             <w:r>
               <w:rPr>
                 <w:rFonts w:ascii="Arial" w:hAnsi="Arial" w:cs="Arial"/>
-              </w:rPr>
-              <w:t> </w:t>
-            </w:r>
-            <w:r>
-              <w:rPr>
-                <w:rFonts w:ascii="Aptos" w:hAnsi="Aptos" w:cs="Aptos"/>
-              </w:rPr>
-              <w:t>→</w:t>
-            </w:r>
-            <w:r>
-              <w:rPr>
-                <w:rFonts w:ascii="Arial" w:hAnsi="Arial" w:cs="Arial"/>
-              </w:rPr>
-              <w:t> </w:t>
-            </w:r>
-            <w:r>
-              <w:t xml:space="preserve">N con </w:t>
-            </w:r>
-            <w:r>
-              <w:rPr>
                 <w:i/>
                 <w:iCs/>
               </w:rPr>
@@ -965,28 +969,32 @@
     <w:p>
       <w:pPr>
         <w:rPr>
-          <w:b/>
-          <w:bCs/>
-        </w:rPr>
-      </w:pPr>
-    </w:p>
-    <w:p>
-      <w:pPr>
-        <w:rPr>
-          <w:b/>
-          <w:bCs/>
-        </w:rPr>
-      </w:pPr>
-    </w:p>
-    <w:p>
-      <w:pPr>
-        <w:rPr>
-          <w:b/>
-          <w:bCs/>
-        </w:rPr>
-      </w:pPr>
-      <w:r>
-        <w:rPr>
+          <w:rFonts w:ascii="Arial" w:hAnsi="Arial" w:cs="Arial"/>
+          <w:b/>
+          <w:bCs/>
+        </w:rPr>
+      </w:pPr>
+    </w:p>
+    <w:p>
+      <w:pPr>
+        <w:rPr>
+          <w:rFonts w:ascii="Arial" w:hAnsi="Arial" w:cs="Arial"/>
+          <w:b/>
+          <w:bCs/>
+        </w:rPr>
+      </w:pPr>
+    </w:p>
+    <w:p>
+      <w:pPr>
+        <w:rPr>
+          <w:rFonts w:ascii="Arial" w:hAnsi="Arial" w:cs="Arial"/>
+          <w:b/>
+          <w:bCs/>
+        </w:rPr>
+      </w:pPr>
+      <w:r>
+        <w:rPr>
+          <w:rFonts w:ascii="Arial" w:hAnsi="Arial" w:cs="Arial"/>
           <w:b/>
           <w:bCs/>
         </w:rPr>
@@ -994,6 +1002,7 @@
       </w:r>
       <w:r>
         <w:rPr>
+          <w:rFonts w:ascii="Arial" w:hAnsi="Arial" w:cs="Arial"/>
           <w:b/>
           <w:bCs/>
         </w:rPr>
@@ -1004,12 +1013,14 @@
     <w:p>
       <w:pPr>
         <w:rPr>
-          <w:b/>
-          <w:bCs/>
-        </w:rPr>
-      </w:pPr>
-      <w:r>
-        <w:rPr>
+          <w:rFonts w:ascii="Arial" w:hAnsi="Arial" w:cs="Arial"/>
+          <w:b/>
+          <w:bCs/>
+        </w:rPr>
+      </w:pPr>
+      <w:r>
+        <w:rPr>
+          <w:rFonts w:ascii="Arial" w:hAnsi="Arial" w:cs="Arial"/>
           <w:b/>
           <w:bCs/>
         </w:rPr>
@@ -1022,93 +1033,15 @@
           <w:ilvl w:val="0"/>
           <w:numId w:val="4"/>
         </w:numPr>
-      </w:pPr>
-      <w:r>
-        <w:t>Cliente</w:t>
-      </w:r>
-      <w:r>
-        <w:rPr>
-          <w:rFonts w:ascii="Arial" w:hAnsi="Arial" w:cs="Arial"/>
-        </w:rPr>
-        <w:t> </w:t>
-      </w:r>
-      <w:r>
-        <w:rPr>
-          <w:rFonts w:ascii="Aptos" w:hAnsi="Aptos" w:cs="Aptos"/>
-        </w:rPr>
-        <w:t>→</w:t>
-      </w:r>
-      <w:r>
-        <w:rPr>
-          <w:rFonts w:ascii="Arial" w:hAnsi="Arial" w:cs="Arial"/>
-        </w:rPr>
-        <w:t> </w:t>
-      </w:r>
-      <w:r>
-        <w:t>Equipos</w:t>
-      </w:r>
-      <w:r>
-        <w:rPr>
-          <w:rFonts w:ascii="Arial" w:hAnsi="Arial" w:cs="Arial"/>
-        </w:rPr>
-        <w:t> </w:t>
-      </w:r>
-      <w:r>
-        <w:rPr>
-          <w:rFonts w:ascii="Aptos" w:hAnsi="Aptos" w:cs="Aptos"/>
-        </w:rPr>
-        <w:t>→</w:t>
-      </w:r>
-      <w:r>
-        <w:rPr>
-          <w:rFonts w:ascii="Arial" w:hAnsi="Arial" w:cs="Arial"/>
-        </w:rPr>
-        <w:t> </w:t>
-      </w:r>
-      <w:r>
-        <w:t>OrdenesReparacion</w:t>
-      </w:r>
-      <w:r>
-        <w:rPr>
-          <w:rFonts w:ascii="Arial" w:hAnsi="Arial" w:cs="Arial"/>
-        </w:rPr>
-        <w:t> </w:t>
-      </w:r>
-      <w:r>
-        <w:rPr>
-          <w:rFonts w:ascii="Aptos" w:hAnsi="Aptos" w:cs="Aptos"/>
-        </w:rPr>
-        <w:t>→</w:t>
-      </w:r>
-      <w:r>
-        <w:rPr>
-          <w:rFonts w:ascii="Arial" w:hAnsi="Arial" w:cs="Arial"/>
-        </w:rPr>
-        <w:t> </w:t>
-      </w:r>
-      <w:r>
-        <w:t>Facturas</w:t>
-      </w:r>
-      <w:r>
-        <w:rPr>
-          <w:rFonts w:ascii="Arial" w:hAnsi="Arial" w:cs="Arial"/>
-        </w:rPr>
-        <w:t> </w:t>
-      </w:r>
-      <w:r>
-        <w:rPr>
-          <w:rFonts w:ascii="Aptos" w:hAnsi="Aptos" w:cs="Aptos"/>
-        </w:rPr>
-        <w:t>→</w:t>
-      </w:r>
-      <w:r>
-        <w:rPr>
-          <w:rFonts w:ascii="Arial" w:hAnsi="Arial" w:cs="Arial"/>
-        </w:rPr>
-        <w:t> </w:t>
-      </w:r>
-      <w:r>
-        <w:t>DetalleFactura</w:t>
+        <w:rPr>
+          <w:rFonts w:ascii="Arial" w:hAnsi="Arial" w:cs="Arial"/>
+        </w:rPr>
+      </w:pPr>
+      <w:r>
+        <w:rPr>
+          <w:rFonts w:ascii="Arial" w:hAnsi="Arial" w:cs="Arial"/>
+        </w:rPr>
+        <w:t>Cliente → Equipos → OrdenesReparacion → Facturas → DetalleFactura</w:t>
       </w:r>
     </w:p>
     <w:p>
@@ -1117,53 +1050,34 @@
           <w:ilvl w:val="0"/>
           <w:numId w:val="4"/>
         </w:numPr>
-      </w:pPr>
-      <w:r>
-        <w:t>Estados Orden</w:t>
-      </w:r>
-      <w:r>
-        <w:t xml:space="preserve"> controla el flujo de cada orden.</w:t>
-      </w:r>
-    </w:p>
-    <w:p>
-      <w:pPr>
-        <w:rPr>
-          <w:b/>
-          <w:bCs/>
-        </w:rPr>
-      </w:pPr>
-      <w:r>
-        <w:t>El diseño fue validado visualmente en SQL</w:t>
-      </w:r>
-      <w:r>
-        <w:rPr>
-          <w:rFonts w:ascii="Arial" w:hAnsi="Arial" w:cs="Arial"/>
-        </w:rPr>
-        <w:t> </w:t>
-      </w:r>
-      <w:r>
-        <w:t>Server</w:t>
-      </w:r>
-      <w:r>
-        <w:rPr>
-          <w:rFonts w:ascii="Arial" w:hAnsi="Arial" w:cs="Arial"/>
-        </w:rPr>
-        <w:t> </w:t>
-      </w:r>
-      <w:r>
-        <w:t>Management</w:t>
-      </w:r>
-      <w:r>
-        <w:rPr>
-          <w:rFonts w:ascii="Arial" w:hAnsi="Arial" w:cs="Arial"/>
-        </w:rPr>
-        <w:t> </w:t>
-      </w:r>
-      <w:r>
-        <w:t>Studio</w:t>
-      </w:r>
-      <w:r>
-        <w:rPr>
+        <w:rPr>
+          <w:rFonts w:ascii="Arial" w:hAnsi="Arial" w:cs="Arial"/>
+        </w:rPr>
+      </w:pPr>
+      <w:r>
+        <w:rPr>
+          <w:rFonts w:ascii="Arial" w:hAnsi="Arial" w:cs="Arial"/>
+        </w:rPr>
+        <w:t>Estados Orden controla el flujo de cada orden.</w:t>
+      </w:r>
+    </w:p>
+    <w:p>
+      <w:pPr>
+        <w:rPr>
+          <w:rFonts w:ascii="Arial" w:hAnsi="Arial" w:cs="Arial"/>
+          <w:b/>
+          <w:bCs/>
+        </w:rPr>
+      </w:pPr>
+      <w:r>
+        <w:rPr>
+          <w:rFonts w:ascii="Arial" w:hAnsi="Arial" w:cs="Arial"/>
+        </w:rPr>
+        <w:t>El diseño fue validado visualmente en SQL Server Management Studio</w:t>
+      </w:r>
+      <w:r>
+        <w:rPr>
+          <w:rFonts w:ascii="Arial" w:hAnsi="Arial" w:cs="Arial"/>
           <w:b/>
           <w:bCs/>
         </w:rPr>
@@ -1174,14 +1088,17 @@
       <w:pPr>
         <w:jc w:val="center"/>
         <w:rPr>
-          <w:b/>
-          <w:bCs/>
-        </w:rPr>
-      </w:pPr>
-      <w:r>
-        <w:rPr>
-          <w:b/>
-          <w:bCs/>
+          <w:rFonts w:ascii="Arial" w:hAnsi="Arial" w:cs="Arial"/>
+          <w:b/>
+          <w:bCs/>
+        </w:rPr>
+      </w:pPr>
+      <w:r>
+        <w:rPr>
+          <w:rFonts w:ascii="Arial" w:hAnsi="Arial" w:cs="Arial"/>
+          <w:b/>
+          <w:bCs/>
+          <w:noProof/>
         </w:rPr>
         <w:lastRenderedPageBreak/>
         <w:drawing>
@@ -1224,47 +1141,53 @@
     <w:p>
       <w:pPr>
         <w:rPr>
-          <w:b/>
-          <w:bCs/>
-        </w:rPr>
-      </w:pPr>
-    </w:p>
-    <w:p>
-      <w:pPr>
-        <w:rPr>
-          <w:b/>
-          <w:bCs/>
-        </w:rPr>
-      </w:pPr>
-      <w:r>
-        <w:rPr>
-          <w:b/>
-          <w:bCs/>
-        </w:rPr>
-        <w:t>4</w:t>
-      </w:r>
-      <w:r>
-        <w:rPr>
-          <w:b/>
-          <w:bCs/>
-        </w:rPr>
-        <w:t>. Conexión desde la Aplicación</w:t>
-      </w:r>
-    </w:p>
-    <w:p>
-      <w:r>
+          <w:rFonts w:ascii="Arial" w:hAnsi="Arial" w:cs="Arial"/>
+          <w:b/>
+          <w:bCs/>
+        </w:rPr>
+      </w:pPr>
+    </w:p>
+    <w:p>
+      <w:pPr>
+        <w:rPr>
+          <w:rFonts w:ascii="Arial" w:hAnsi="Arial" w:cs="Arial"/>
+          <w:b/>
+          <w:bCs/>
+        </w:rPr>
+      </w:pPr>
+      <w:r>
+        <w:rPr>
+          <w:rFonts w:ascii="Arial" w:hAnsi="Arial" w:cs="Arial"/>
+          <w:b/>
+          <w:bCs/>
+        </w:rPr>
+        <w:t>4. Conexión desde la Aplicación</w:t>
+      </w:r>
+    </w:p>
+    <w:p>
+      <w:pPr>
+        <w:rPr>
+          <w:rFonts w:ascii="Arial" w:hAnsi="Arial" w:cs="Arial"/>
+        </w:rPr>
+      </w:pPr>
+      <w:r>
+        <w:rPr>
+          <w:rFonts w:ascii="Arial" w:hAnsi="Arial" w:cs="Arial"/>
+        </w:rPr>
         <w:t>Se creó una clase en C# para manejar la conexión a la base de datos. Esta clase incluye un método para probar la conexión y confirmar que el sistema puede comunicarse con SQL Server.</w:t>
       </w:r>
     </w:p>
     <w:p>
       <w:pPr>
         <w:rPr>
-          <w:b/>
-          <w:bCs/>
-        </w:rPr>
-      </w:pPr>
-      <w:r>
-        <w:rPr>
+          <w:rFonts w:ascii="Arial" w:hAnsi="Arial" w:cs="Arial"/>
+          <w:b/>
+          <w:bCs/>
+        </w:rPr>
+      </w:pPr>
+      <w:r>
+        <w:rPr>
+          <w:rFonts w:ascii="Arial" w:hAnsi="Arial" w:cs="Arial"/>
           <w:b/>
           <w:bCs/>
         </w:rPr>
@@ -1272,6 +1195,7 @@
       </w:r>
       <w:r>
         <w:rPr>
+          <w:rFonts w:ascii="Arial" w:hAnsi="Arial" w:cs="Arial"/>
           <w:b/>
           <w:bCs/>
         </w:rPr>
@@ -1279,16 +1203,37 @@
       </w:r>
     </w:p>
     <w:p>
-      <w:r>
+      <w:pPr>
+        <w:rPr>
+          <w:rFonts w:ascii="Arial" w:hAnsi="Arial" w:cs="Arial"/>
+        </w:rPr>
+      </w:pPr>
+      <w:r>
+        <w:rPr>
+          <w:rFonts w:ascii="Arial" w:hAnsi="Arial" w:cs="Arial"/>
+        </w:rPr>
         <w:t>Se implementó una prueba dentro de la aplicación WPF. Al iniciar la ventana principal, el sistema verifica la conexión y muestra un mensaje indicando si fue exitosa. El resultado fue positivo: la aplicación se conectó correctamente a la base de datos.</w:t>
       </w:r>
     </w:p>
-    <w:p/>
+    <w:p>
+      <w:pPr>
+        <w:rPr>
+          <w:rFonts w:ascii="Arial" w:hAnsi="Arial" w:cs="Arial"/>
+        </w:rPr>
+      </w:pPr>
+    </w:p>
     <w:p>
       <w:pPr>
         <w:jc w:val="center"/>
-      </w:pPr>
-      <w:r>
+        <w:rPr>
+          <w:rFonts w:ascii="Arial" w:hAnsi="Arial" w:cs="Arial"/>
+        </w:rPr>
+      </w:pPr>
+      <w:r>
+        <w:rPr>
+          <w:rFonts w:ascii="Arial" w:hAnsi="Arial" w:cs="Arial"/>
+          <w:noProof/>
+        </w:rPr>
         <w:drawing>
           <wp:inline distT="0" distB="0" distL="0" distR="0" wp14:anchorId="57F1E750" wp14:editId="64707D17">
             <wp:extent cx="3995856" cy="2341880"/>
@@ -1326,24 +1271,42 @@
         </w:drawing>
       </w:r>
     </w:p>
-    <w:p/>
-    <w:p>
-      <w:pPr>
-        <w:rPr>
-          <w:b/>
-          <w:bCs/>
-        </w:rPr>
-      </w:pPr>
-    </w:p>
-    <w:p>
-      <w:pPr>
-        <w:rPr>
-          <w:b/>
-          <w:bCs/>
-        </w:rPr>
-      </w:pPr>
-      <w:r>
-        <w:rPr>
+    <w:p>
+      <w:pPr>
+        <w:rPr>
+          <w:rFonts w:ascii="Arial" w:hAnsi="Arial" w:cs="Arial"/>
+        </w:rPr>
+      </w:pPr>
+    </w:p>
+    <w:p>
+      <w:pPr>
+        <w:rPr>
+          <w:rFonts w:ascii="Arial" w:hAnsi="Arial" w:cs="Arial"/>
+          <w:b/>
+          <w:bCs/>
+        </w:rPr>
+      </w:pPr>
+    </w:p>
+    <w:p>
+      <w:pPr>
+        <w:rPr>
+          <w:rFonts w:ascii="Arial" w:hAnsi="Arial" w:cs="Arial"/>
+          <w:b/>
+          <w:bCs/>
+        </w:rPr>
+      </w:pPr>
+    </w:p>
+    <w:p>
+      <w:pPr>
+        <w:rPr>
+          <w:rFonts w:ascii="Arial" w:hAnsi="Arial" w:cs="Arial"/>
+          <w:b/>
+          <w:bCs/>
+        </w:rPr>
+      </w:pPr>
+      <w:r>
+        <w:rPr>
+          <w:rFonts w:ascii="Arial" w:hAnsi="Arial" w:cs="Arial"/>
           <w:b/>
           <w:bCs/>
         </w:rPr>
@@ -1352,6 +1315,7 @@
       </w:r>
       <w:r>
         <w:rPr>
+          <w:rFonts w:ascii="Arial" w:hAnsi="Arial" w:cs="Arial"/>
           <w:b/>
           <w:bCs/>
         </w:rPr>
@@ -1364,8 +1328,14 @@
           <w:ilvl w:val="0"/>
           <w:numId w:val="3"/>
         </w:numPr>
-      </w:pPr>
-      <w:r>
+        <w:rPr>
+          <w:rFonts w:ascii="Arial" w:hAnsi="Arial" w:cs="Arial"/>
+        </w:rPr>
+      </w:pPr>
+      <w:r>
+        <w:rPr>
+          <w:rFonts w:ascii="Arial" w:hAnsi="Arial" w:cs="Arial"/>
+        </w:rPr>
         <w:t>La base de datos está diseñada y creada.</w:t>
       </w:r>
     </w:p>
@@ -1375,8 +1345,14 @@
           <w:ilvl w:val="0"/>
           <w:numId w:val="3"/>
         </w:numPr>
-      </w:pPr>
-      <w:r>
+        <w:rPr>
+          <w:rFonts w:ascii="Arial" w:hAnsi="Arial" w:cs="Arial"/>
+        </w:rPr>
+      </w:pPr>
+      <w:r>
+        <w:rPr>
+          <w:rFonts w:ascii="Arial" w:hAnsi="Arial" w:cs="Arial"/>
+        </w:rPr>
         <w:t>Las relaciones entre tablas están definidas y validadas.</w:t>
       </w:r>
     </w:p>
@@ -1386,8 +1362,14 @@
           <w:ilvl w:val="0"/>
           <w:numId w:val="3"/>
         </w:numPr>
-      </w:pPr>
-      <w:r>
+        <w:rPr>
+          <w:rFonts w:ascii="Arial" w:hAnsi="Arial" w:cs="Arial"/>
+        </w:rPr>
+      </w:pPr>
+      <w:r>
+        <w:rPr>
+          <w:rFonts w:ascii="Arial" w:hAnsi="Arial" w:cs="Arial"/>
+        </w:rPr>
         <w:t>La conexión desde la aplicación funciona correctamente.</w:t>
       </w:r>
     </w:p>
@@ -1397,9 +1379,1207 @@
           <w:ilvl w:val="0"/>
           <w:numId w:val="3"/>
         </w:numPr>
-      </w:pPr>
-      <w:r>
+        <w:rPr>
+          <w:rFonts w:ascii="Arial" w:hAnsi="Arial" w:cs="Arial"/>
+        </w:rPr>
+      </w:pPr>
+      <w:r>
+        <w:rPr>
+          <w:rFonts w:ascii="Arial" w:hAnsi="Arial" w:cs="Arial"/>
+        </w:rPr>
         <w:t>El sistema está listo para avanzar hacia la implementación de operaciones CRUD (crear, leer, actualizar y eliminar) para clientes, equipos, órdenes y facturas.</w:t>
+      </w:r>
+    </w:p>
+    <w:p>
+      <w:pPr>
+        <w:rPr>
+          <w:rFonts w:ascii="Arial" w:hAnsi="Arial" w:cs="Arial"/>
+        </w:rPr>
+      </w:pPr>
+    </w:p>
+    <w:p>
+      <w:pPr>
+        <w:rPr>
+          <w:rFonts w:ascii="Arial" w:hAnsi="Arial" w:cs="Arial"/>
+          <w:b/>
+          <w:bCs/>
+          <w:sz w:val="28"/>
+          <w:szCs w:val="28"/>
+        </w:rPr>
+      </w:pPr>
+      <w:r>
+        <w:rPr>
+          <w:rFonts w:ascii="Arial" w:hAnsi="Arial" w:cs="Arial"/>
+          <w:b/>
+          <w:bCs/>
+          <w:sz w:val="28"/>
+          <w:szCs w:val="28"/>
+        </w:rPr>
+        <w:t xml:space="preserve">Proyecto </w:t>
+      </w:r>
+      <w:proofErr w:type="spellStart"/>
+      <w:r>
+        <w:rPr>
+          <w:rFonts w:ascii="Arial" w:hAnsi="Arial" w:cs="Arial"/>
+          <w:b/>
+          <w:bCs/>
+          <w:sz w:val="28"/>
+          <w:szCs w:val="28"/>
+        </w:rPr>
+        <w:t>TallerPro</w:t>
+      </w:r>
+      <w:proofErr w:type="spellEnd"/>
+      <w:r>
+        <w:rPr>
+          <w:rFonts w:ascii="Arial" w:hAnsi="Arial" w:cs="Arial"/>
+          <w:b/>
+          <w:bCs/>
+          <w:sz w:val="28"/>
+          <w:szCs w:val="28"/>
+        </w:rPr>
+        <w:t xml:space="preserve"> - (0</w:t>
+      </w:r>
+      <w:r>
+        <w:rPr>
+          <w:rFonts w:ascii="Arial" w:hAnsi="Arial" w:cs="Arial"/>
+          <w:b/>
+          <w:bCs/>
+          <w:sz w:val="28"/>
+          <w:szCs w:val="28"/>
+        </w:rPr>
+        <w:t>8</w:t>
+      </w:r>
+      <w:r>
+        <w:rPr>
+          <w:rFonts w:ascii="Arial" w:hAnsi="Arial" w:cs="Arial"/>
+          <w:b/>
+          <w:bCs/>
+          <w:sz w:val="28"/>
+          <w:szCs w:val="28"/>
+        </w:rPr>
+        <w:t>/09/2026)</w:t>
+      </w:r>
+    </w:p>
+    <w:p>
+      <w:pPr>
+        <w:rPr>
+          <w:rFonts w:ascii="Arial" w:hAnsi="Arial" w:cs="Arial"/>
+          <w:b/>
+          <w:bCs/>
+          <w:sz w:val="28"/>
+          <w:szCs w:val="28"/>
+        </w:rPr>
+      </w:pPr>
+    </w:p>
+    <w:p>
+      <w:pPr>
+        <w:rPr>
+          <w:rFonts w:ascii="Arial" w:hAnsi="Arial" w:cs="Arial"/>
+          <w:b/>
+          <w:bCs/>
+        </w:rPr>
+      </w:pPr>
+      <w:r>
+        <w:rPr>
+          <w:rFonts w:ascii="Arial" w:hAnsi="Arial" w:cs="Arial"/>
+          <w:b/>
+          <w:bCs/>
+        </w:rPr>
+        <w:t>Objetivo del día</w:t>
+      </w:r>
+    </w:p>
+    <w:p>
+      <w:pPr>
+        <w:rPr>
+          <w:rFonts w:ascii="Arial" w:hAnsi="Arial" w:cs="Arial"/>
+        </w:rPr>
+      </w:pPr>
+      <w:r>
+        <w:rPr>
+          <w:rFonts w:ascii="Arial" w:hAnsi="Arial" w:cs="Arial"/>
+        </w:rPr>
+        <w:t xml:space="preserve">El objetivo principal del segundo día de trabajo fue </w:t>
+      </w:r>
+      <w:r>
+        <w:rPr>
+          <w:rFonts w:ascii="Arial" w:hAnsi="Arial" w:cs="Arial"/>
+          <w:b/>
+          <w:bCs/>
+        </w:rPr>
+        <w:t>crear el</w:t>
+      </w:r>
+      <w:r>
+        <w:rPr>
+          <w:rFonts w:ascii="Arial" w:hAnsi="Arial" w:cs="Arial"/>
+          <w:b/>
+          <w:bCs/>
+        </w:rPr>
+        <w:t xml:space="preserve"> módulo de Clientes de </w:t>
+      </w:r>
+      <w:proofErr w:type="spellStart"/>
+      <w:r>
+        <w:rPr>
+          <w:rFonts w:ascii="Arial" w:hAnsi="Arial" w:cs="Arial"/>
+          <w:b/>
+          <w:bCs/>
+        </w:rPr>
+        <w:t>TallerPro</w:t>
+      </w:r>
+      <w:proofErr w:type="spellEnd"/>
+      <w:r>
+        <w:rPr>
+          <w:rFonts w:ascii="Arial" w:hAnsi="Arial" w:cs="Arial"/>
+        </w:rPr>
+        <w:t>, conservando el diseño visual que ya se había realizado y comenzando a convertirlo en un módulo funcional.</w:t>
+      </w:r>
+    </w:p>
+    <w:p>
+      <w:pPr>
+        <w:rPr>
+          <w:rFonts w:ascii="Arial" w:hAnsi="Arial" w:cs="Arial"/>
+          <w:b/>
+          <w:bCs/>
+        </w:rPr>
+      </w:pPr>
+      <w:r>
+        <w:rPr>
+          <w:rFonts w:ascii="Arial" w:hAnsi="Arial" w:cs="Arial"/>
+          <w:b/>
+          <w:bCs/>
+        </w:rPr>
+        <w:t>Estructura del proyecto</w:t>
+      </w:r>
+    </w:p>
+    <w:p>
+      <w:pPr>
+        <w:rPr>
+          <w:rFonts w:ascii="Arial" w:hAnsi="Arial" w:cs="Arial"/>
+        </w:rPr>
+      </w:pPr>
+      <w:r>
+        <w:rPr>
+          <w:rFonts w:ascii="Arial" w:hAnsi="Arial" w:cs="Arial"/>
+        </w:rPr>
+        <w:t>Para mantener el código organizado se estableció una estructura basada en el patrón de arquitectura MVVM, separando la interfaz gráfica, los datos y la lógica de la aplicación.</w:t>
+      </w:r>
+    </w:p>
+    <w:p>
+      <w:pPr>
+        <w:rPr>
+          <w:rFonts w:ascii="Arial" w:hAnsi="Arial" w:cs="Arial"/>
+        </w:rPr>
+      </w:pPr>
+      <w:r>
+        <w:rPr>
+          <w:rFonts w:ascii="Arial" w:hAnsi="Arial" w:cs="Arial"/>
+        </w:rPr>
+        <w:t>La estructura utilizada para el módulo de clientes es:</w:t>
+      </w:r>
+    </w:p>
+    <w:p>
+      <w:pPr>
+        <w:rPr>
+          <w:rFonts w:ascii="Arial" w:hAnsi="Arial" w:cs="Arial"/>
+        </w:rPr>
+      </w:pPr>
+      <w:r>
+        <w:rPr>
+          <w:rFonts w:ascii="Arial" w:hAnsi="Arial" w:cs="Arial"/>
+        </w:rPr>
+        <w:t>TallerPro1.0</w:t>
+      </w:r>
+    </w:p>
+    <w:p>
+      <w:pPr>
+        <w:rPr>
+          <w:rFonts w:ascii="Arial" w:hAnsi="Arial" w:cs="Arial"/>
+        </w:rPr>
+      </w:pPr>
+    </w:p>
+    <w:p>
+      <w:pPr>
+        <w:rPr>
+          <w:rFonts w:ascii="Arial" w:hAnsi="Arial" w:cs="Arial"/>
+        </w:rPr>
+      </w:pPr>
+      <w:r>
+        <w:rPr>
+          <w:rFonts w:ascii="Arial" w:hAnsi="Arial" w:cs="Arial"/>
+        </w:rPr>
+        <w:t>│</w:t>
+      </w:r>
+    </w:p>
+    <w:p>
+      <w:pPr>
+        <w:rPr>
+          <w:rFonts w:ascii="Arial" w:hAnsi="Arial" w:cs="Arial"/>
+        </w:rPr>
+      </w:pPr>
+      <w:r>
+        <w:rPr>
+          <w:rFonts w:ascii="Arial" w:eastAsia="MS Gothic" w:hAnsi="Arial" w:cs="Arial"/>
+        </w:rPr>
+        <w:t>├</w:t>
+      </w:r>
+      <w:r>
+        <w:rPr>
+          <w:rFonts w:ascii="Arial" w:hAnsi="Arial" w:cs="Arial"/>
+        </w:rPr>
+        <w:t xml:space="preserve">── </w:t>
+      </w:r>
+      <w:proofErr w:type="spellStart"/>
+      <w:r>
+        <w:rPr>
+          <w:rFonts w:ascii="Arial" w:hAnsi="Arial" w:cs="Arial"/>
+        </w:rPr>
+        <w:t>Models</w:t>
+      </w:r>
+      <w:proofErr w:type="spellEnd"/>
+    </w:p>
+    <w:p>
+      <w:pPr>
+        <w:rPr>
+          <w:rFonts w:ascii="Arial" w:hAnsi="Arial" w:cs="Arial"/>
+        </w:rPr>
+      </w:pPr>
+      <w:r>
+        <w:rPr>
+          <w:rFonts w:ascii="Arial" w:hAnsi="Arial" w:cs="Arial"/>
+        </w:rPr>
+        <w:t xml:space="preserve">│   └── </w:t>
+      </w:r>
+      <w:proofErr w:type="spellStart"/>
+      <w:r>
+        <w:rPr>
+          <w:rFonts w:ascii="Arial" w:hAnsi="Arial" w:cs="Arial"/>
+        </w:rPr>
+        <w:t>Cliente.cs</w:t>
+      </w:r>
+      <w:proofErr w:type="spellEnd"/>
+    </w:p>
+    <w:p>
+      <w:pPr>
+        <w:rPr>
+          <w:rFonts w:ascii="Arial" w:hAnsi="Arial" w:cs="Arial"/>
+        </w:rPr>
+      </w:pPr>
+      <w:r>
+        <w:rPr>
+          <w:rFonts w:ascii="Arial" w:hAnsi="Arial" w:cs="Arial"/>
+        </w:rPr>
+        <w:t>│</w:t>
+      </w:r>
+    </w:p>
+    <w:p>
+      <w:pPr>
+        <w:rPr>
+          <w:rFonts w:ascii="Arial" w:hAnsi="Arial" w:cs="Arial"/>
+        </w:rPr>
+      </w:pPr>
+      <w:r>
+        <w:rPr>
+          <w:rFonts w:ascii="Arial" w:eastAsia="MS Gothic" w:hAnsi="Arial" w:cs="Arial"/>
+        </w:rPr>
+        <w:t>├</w:t>
+      </w:r>
+      <w:r>
+        <w:rPr>
+          <w:rFonts w:ascii="Arial" w:hAnsi="Arial" w:cs="Arial"/>
+        </w:rPr>
+        <w:t xml:space="preserve">── </w:t>
+      </w:r>
+      <w:proofErr w:type="spellStart"/>
+      <w:r>
+        <w:rPr>
+          <w:rFonts w:ascii="Arial" w:hAnsi="Arial" w:cs="Arial"/>
+        </w:rPr>
+        <w:t>Services</w:t>
+      </w:r>
+      <w:proofErr w:type="spellEnd"/>
+    </w:p>
+    <w:p>
+      <w:pPr>
+        <w:rPr>
+          <w:rFonts w:ascii="Arial" w:hAnsi="Arial" w:cs="Arial"/>
+        </w:rPr>
+      </w:pPr>
+      <w:r>
+        <w:rPr>
+          <w:rFonts w:ascii="Arial" w:hAnsi="Arial" w:cs="Arial"/>
+        </w:rPr>
+        <w:t xml:space="preserve">│   └── </w:t>
+      </w:r>
+      <w:proofErr w:type="spellStart"/>
+      <w:r>
+        <w:rPr>
+          <w:rFonts w:ascii="Arial" w:hAnsi="Arial" w:cs="Arial"/>
+        </w:rPr>
+        <w:t>ClienteService.cs</w:t>
+      </w:r>
+      <w:proofErr w:type="spellEnd"/>
+    </w:p>
+    <w:p>
+      <w:pPr>
+        <w:rPr>
+          <w:rFonts w:ascii="Arial" w:hAnsi="Arial" w:cs="Arial"/>
+        </w:rPr>
+      </w:pPr>
+      <w:r>
+        <w:rPr>
+          <w:rFonts w:ascii="Arial" w:hAnsi="Arial" w:cs="Arial"/>
+        </w:rPr>
+        <w:t>│</w:t>
+      </w:r>
+    </w:p>
+    <w:p>
+      <w:pPr>
+        <w:rPr>
+          <w:rFonts w:ascii="Arial" w:hAnsi="Arial" w:cs="Arial"/>
+        </w:rPr>
+      </w:pPr>
+      <w:r>
+        <w:rPr>
+          <w:rFonts w:ascii="Arial" w:eastAsia="MS Gothic" w:hAnsi="Arial" w:cs="Arial"/>
+        </w:rPr>
+        <w:t>├</w:t>
+      </w:r>
+      <w:r>
+        <w:rPr>
+          <w:rFonts w:ascii="Arial" w:hAnsi="Arial" w:cs="Arial"/>
+        </w:rPr>
+        <w:t xml:space="preserve">── </w:t>
+      </w:r>
+      <w:proofErr w:type="spellStart"/>
+      <w:r>
+        <w:rPr>
+          <w:rFonts w:ascii="Arial" w:hAnsi="Arial" w:cs="Arial"/>
+        </w:rPr>
+        <w:t>ViewModels</w:t>
+      </w:r>
+      <w:proofErr w:type="spellEnd"/>
+    </w:p>
+    <w:p>
+      <w:pPr>
+        <w:rPr>
+          <w:rFonts w:ascii="Arial" w:hAnsi="Arial" w:cs="Arial"/>
+        </w:rPr>
+      </w:pPr>
+      <w:r>
+        <w:rPr>
+          <w:rFonts w:ascii="Arial" w:hAnsi="Arial" w:cs="Arial"/>
+        </w:rPr>
+        <w:t xml:space="preserve">│   └── </w:t>
+      </w:r>
+      <w:proofErr w:type="spellStart"/>
+      <w:r>
+        <w:rPr>
+          <w:rFonts w:ascii="Arial" w:hAnsi="Arial" w:cs="Arial"/>
+        </w:rPr>
+        <w:t>ClienteViewModel.cs</w:t>
+      </w:r>
+      <w:proofErr w:type="spellEnd"/>
+    </w:p>
+    <w:p>
+      <w:pPr>
+        <w:rPr>
+          <w:rFonts w:ascii="Arial" w:hAnsi="Arial" w:cs="Arial"/>
+        </w:rPr>
+      </w:pPr>
+      <w:r>
+        <w:rPr>
+          <w:rFonts w:ascii="Arial" w:hAnsi="Arial" w:cs="Arial"/>
+        </w:rPr>
+        <w:t>│</w:t>
+      </w:r>
+    </w:p>
+    <w:p>
+      <w:pPr>
+        <w:rPr>
+          <w:rFonts w:ascii="Arial" w:hAnsi="Arial" w:cs="Arial"/>
+        </w:rPr>
+      </w:pPr>
+      <w:r>
+        <w:rPr>
+          <w:rFonts w:ascii="Arial" w:hAnsi="Arial" w:cs="Arial"/>
+        </w:rPr>
+        <w:lastRenderedPageBreak/>
+        <w:t xml:space="preserve">└── </w:t>
+      </w:r>
+      <w:proofErr w:type="spellStart"/>
+      <w:r>
+        <w:rPr>
+          <w:rFonts w:ascii="Arial" w:hAnsi="Arial" w:cs="Arial"/>
+        </w:rPr>
+        <w:t>Views</w:t>
+      </w:r>
+      <w:proofErr w:type="spellEnd"/>
+    </w:p>
+    <w:p>
+      <w:pPr>
+        <w:rPr>
+          <w:rFonts w:ascii="Arial" w:hAnsi="Arial" w:cs="Arial"/>
+        </w:rPr>
+      </w:pPr>
+      <w:r>
+        <w:rPr>
+          <w:rFonts w:ascii="Arial" w:hAnsi="Arial" w:cs="Arial"/>
+        </w:rPr>
+        <w:t xml:space="preserve">    └── </w:t>
+      </w:r>
+      <w:proofErr w:type="spellStart"/>
+      <w:r>
+        <w:rPr>
+          <w:rFonts w:ascii="Arial" w:hAnsi="Arial" w:cs="Arial"/>
+        </w:rPr>
+        <w:t>ClientesView.xaml</w:t>
+      </w:r>
+      <w:proofErr w:type="spellEnd"/>
+    </w:p>
+    <w:p>
+      <w:pPr>
+        <w:rPr>
+          <w:rFonts w:ascii="Arial" w:hAnsi="Arial" w:cs="Arial"/>
+        </w:rPr>
+      </w:pPr>
+      <w:r>
+        <w:rPr>
+          <w:rFonts w:ascii="Arial" w:hAnsi="Arial" w:cs="Arial"/>
+        </w:rPr>
+        <w:t>Cada componente tiene una responsabilidad determinada dentro del sistema.</w:t>
+      </w:r>
+    </w:p>
+    <w:p>
+      <w:pPr>
+        <w:rPr>
+          <w:rFonts w:ascii="Arial" w:hAnsi="Arial" w:cs="Arial"/>
+          <w:b/>
+          <w:bCs/>
+        </w:rPr>
+      </w:pPr>
+      <w:r>
+        <w:rPr>
+          <w:rFonts w:ascii="Arial" w:hAnsi="Arial" w:cs="Arial"/>
+          <w:b/>
+          <w:bCs/>
+        </w:rPr>
+        <w:t>Modelo</w:t>
+      </w:r>
+    </w:p>
+    <w:p>
+      <w:pPr>
+        <w:rPr>
+          <w:rFonts w:ascii="Arial" w:hAnsi="Arial" w:cs="Arial"/>
+        </w:rPr>
+      </w:pPr>
+      <w:r>
+        <w:rPr>
+          <w:rFonts w:ascii="Arial" w:hAnsi="Arial" w:cs="Arial"/>
+        </w:rPr>
+        <w:t xml:space="preserve">El archivo </w:t>
+      </w:r>
+      <w:proofErr w:type="spellStart"/>
+      <w:r>
+        <w:rPr>
+          <w:rFonts w:ascii="Arial" w:hAnsi="Arial" w:cs="Arial"/>
+        </w:rPr>
+        <w:t>Cliente.cs</w:t>
+      </w:r>
+      <w:proofErr w:type="spellEnd"/>
+      <w:r>
+        <w:rPr>
+          <w:rFonts w:ascii="Arial" w:hAnsi="Arial" w:cs="Arial"/>
+        </w:rPr>
+        <w:t xml:space="preserve"> representa la información de los clientes que serán almacenados y utilizados por la aplicación.</w:t>
+      </w:r>
+    </w:p>
+    <w:p>
+      <w:pPr>
+        <w:rPr>
+          <w:rFonts w:ascii="Arial" w:hAnsi="Arial" w:cs="Arial"/>
+          <w:b/>
+          <w:bCs/>
+        </w:rPr>
+      </w:pPr>
+      <w:r>
+        <w:rPr>
+          <w:rFonts w:ascii="Arial" w:hAnsi="Arial" w:cs="Arial"/>
+          <w:b/>
+          <w:bCs/>
+        </w:rPr>
+        <w:t>Servicio</w:t>
+      </w:r>
+    </w:p>
+    <w:p>
+      <w:pPr>
+        <w:rPr>
+          <w:rFonts w:ascii="Arial" w:hAnsi="Arial" w:cs="Arial"/>
+        </w:rPr>
+      </w:pPr>
+      <w:proofErr w:type="spellStart"/>
+      <w:r>
+        <w:rPr>
+          <w:rFonts w:ascii="Arial" w:hAnsi="Arial" w:cs="Arial"/>
+        </w:rPr>
+        <w:t>ClienteService.cs</w:t>
+      </w:r>
+      <w:proofErr w:type="spellEnd"/>
+      <w:r>
+        <w:rPr>
+          <w:rFonts w:ascii="Arial" w:hAnsi="Arial" w:cs="Arial"/>
+        </w:rPr>
+        <w:t xml:space="preserve"> se encarga de las operaciones relacionadas con los datos de los clientes y la comunicación con la base de datos.</w:t>
+      </w:r>
+    </w:p>
+    <w:p>
+      <w:pPr>
+        <w:rPr>
+          <w:rFonts w:ascii="Arial" w:hAnsi="Arial" w:cs="Arial"/>
+          <w:b/>
+          <w:bCs/>
+        </w:rPr>
+      </w:pPr>
+      <w:proofErr w:type="spellStart"/>
+      <w:r>
+        <w:rPr>
+          <w:rFonts w:ascii="Arial" w:hAnsi="Arial" w:cs="Arial"/>
+          <w:b/>
+          <w:bCs/>
+        </w:rPr>
+        <w:t>ViewModel</w:t>
+      </w:r>
+      <w:proofErr w:type="spellEnd"/>
+    </w:p>
+    <w:p>
+      <w:pPr>
+        <w:rPr>
+          <w:rFonts w:ascii="Arial" w:hAnsi="Arial" w:cs="Arial"/>
+        </w:rPr>
+      </w:pPr>
+      <w:proofErr w:type="spellStart"/>
+      <w:r>
+        <w:rPr>
+          <w:rFonts w:ascii="Arial" w:hAnsi="Arial" w:cs="Arial"/>
+        </w:rPr>
+        <w:t>ClienteViewModel.cs</w:t>
+      </w:r>
+      <w:proofErr w:type="spellEnd"/>
+      <w:r>
+        <w:rPr>
+          <w:rFonts w:ascii="Arial" w:hAnsi="Arial" w:cs="Arial"/>
+        </w:rPr>
+        <w:t xml:space="preserve"> contiene la lógica necesaria para conectar la interfaz con las operaciones del sistema. En esta parte se trabajan las propiedades, comandos y acciones relacionadas con los clientes.</w:t>
+      </w:r>
+    </w:p>
+    <w:p>
+      <w:pPr>
+        <w:rPr>
+          <w:rFonts w:ascii="Arial" w:hAnsi="Arial" w:cs="Arial"/>
+          <w:b/>
+          <w:bCs/>
+        </w:rPr>
+      </w:pPr>
+      <w:r>
+        <w:rPr>
+          <w:rFonts w:ascii="Arial" w:hAnsi="Arial" w:cs="Arial"/>
+          <w:b/>
+          <w:bCs/>
+        </w:rPr>
+        <w:t>Vista</w:t>
+      </w:r>
+    </w:p>
+    <w:p>
+      <w:pPr>
+        <w:rPr>
+          <w:rFonts w:ascii="Arial" w:hAnsi="Arial" w:cs="Arial"/>
+        </w:rPr>
+      </w:pPr>
+      <w:proofErr w:type="spellStart"/>
+      <w:r>
+        <w:rPr>
+          <w:rFonts w:ascii="Arial" w:hAnsi="Arial" w:cs="Arial"/>
+        </w:rPr>
+        <w:t>ClientesView.xaml</w:t>
+      </w:r>
+      <w:proofErr w:type="spellEnd"/>
+      <w:r>
+        <w:rPr>
+          <w:rFonts w:ascii="Arial" w:hAnsi="Arial" w:cs="Arial"/>
+        </w:rPr>
+        <w:t xml:space="preserve"> contiene la interfaz gráfica utilizada por el usuario para consultar y administrar los clientes.</w:t>
+      </w:r>
+    </w:p>
+    <w:p>
+      <w:pPr>
+        <w:rPr>
+          <w:rFonts w:ascii="Arial" w:hAnsi="Arial" w:cs="Arial"/>
+          <w:b/>
+          <w:bCs/>
+        </w:rPr>
+      </w:pPr>
+      <w:r>
+        <w:rPr>
+          <w:rFonts w:ascii="Arial" w:hAnsi="Arial" w:cs="Arial"/>
+          <w:b/>
+          <w:bCs/>
+        </w:rPr>
+        <w:t>Funcionalidades del módulo Clientes</w:t>
+      </w:r>
+    </w:p>
+    <w:p>
+      <w:pPr>
+        <w:rPr>
+          <w:rFonts w:ascii="Arial" w:hAnsi="Arial" w:cs="Arial"/>
+        </w:rPr>
+      </w:pPr>
+      <w:r>
+        <w:rPr>
+          <w:rFonts w:ascii="Arial" w:hAnsi="Arial" w:cs="Arial"/>
+        </w:rPr>
+        <w:t>El módulo fue diseñado para permitir la administración de los clientes registrados en el sistema.</w:t>
+      </w:r>
+    </w:p>
+    <w:p>
+      <w:pPr>
+        <w:rPr>
+          <w:rFonts w:ascii="Arial" w:hAnsi="Arial" w:cs="Arial"/>
+        </w:rPr>
+      </w:pPr>
+      <w:r>
+        <w:rPr>
+          <w:rFonts w:ascii="Arial" w:hAnsi="Arial" w:cs="Arial"/>
+        </w:rPr>
+        <w:t>Entre las principales operaciones se encuentran:</w:t>
+      </w:r>
+    </w:p>
+    <w:p>
+      <w:pPr>
+        <w:numPr>
+          <w:ilvl w:val="0"/>
+          <w:numId w:val="6"/>
+        </w:numPr>
+        <w:rPr>
+          <w:rFonts w:ascii="Arial" w:hAnsi="Arial" w:cs="Arial"/>
+        </w:rPr>
+      </w:pPr>
+      <w:r>
+        <w:rPr>
+          <w:rFonts w:ascii="Arial" w:hAnsi="Arial" w:cs="Arial"/>
+        </w:rPr>
+        <w:t>Visualizar los clientes registrados.</w:t>
+      </w:r>
+    </w:p>
+    <w:p>
+      <w:pPr>
+        <w:numPr>
+          <w:ilvl w:val="0"/>
+          <w:numId w:val="6"/>
+        </w:numPr>
+        <w:rPr>
+          <w:rFonts w:ascii="Arial" w:hAnsi="Arial" w:cs="Arial"/>
+        </w:rPr>
+      </w:pPr>
+      <w:r>
+        <w:rPr>
+          <w:rFonts w:ascii="Arial" w:hAnsi="Arial" w:cs="Arial"/>
+        </w:rPr>
+        <w:t>Buscar clientes.</w:t>
+      </w:r>
+    </w:p>
+    <w:p>
+      <w:pPr>
+        <w:numPr>
+          <w:ilvl w:val="0"/>
+          <w:numId w:val="6"/>
+        </w:numPr>
+        <w:rPr>
+          <w:rFonts w:ascii="Arial" w:hAnsi="Arial" w:cs="Arial"/>
+        </w:rPr>
+      </w:pPr>
+      <w:r>
+        <w:rPr>
+          <w:rFonts w:ascii="Arial" w:hAnsi="Arial" w:cs="Arial"/>
+        </w:rPr>
+        <w:t>Registrar nuevos clientes.</w:t>
+      </w:r>
+    </w:p>
+    <w:p>
+      <w:pPr>
+        <w:numPr>
+          <w:ilvl w:val="0"/>
+          <w:numId w:val="6"/>
+        </w:numPr>
+        <w:rPr>
+          <w:rFonts w:ascii="Arial" w:hAnsi="Arial" w:cs="Arial"/>
+        </w:rPr>
+      </w:pPr>
+      <w:r>
+        <w:rPr>
+          <w:rFonts w:ascii="Arial" w:hAnsi="Arial" w:cs="Arial"/>
+        </w:rPr>
+        <w:t>Editar información existente.</w:t>
+      </w:r>
+    </w:p>
+    <w:p>
+      <w:pPr>
+        <w:numPr>
+          <w:ilvl w:val="0"/>
+          <w:numId w:val="6"/>
+        </w:numPr>
+        <w:rPr>
+          <w:rFonts w:ascii="Arial" w:hAnsi="Arial" w:cs="Arial"/>
+        </w:rPr>
+      </w:pPr>
+      <w:r>
+        <w:rPr>
+          <w:rFonts w:ascii="Arial" w:hAnsi="Arial" w:cs="Arial"/>
+        </w:rPr>
+        <w:t>Eliminar clientes.</w:t>
+      </w:r>
+    </w:p>
+    <w:p>
+      <w:pPr>
+        <w:numPr>
+          <w:ilvl w:val="0"/>
+          <w:numId w:val="6"/>
+        </w:numPr>
+        <w:rPr>
+          <w:rFonts w:ascii="Arial" w:hAnsi="Arial" w:cs="Arial"/>
+        </w:rPr>
+      </w:pPr>
+      <w:r>
+        <w:rPr>
+          <w:rFonts w:ascii="Arial" w:hAnsi="Arial" w:cs="Arial"/>
+        </w:rPr>
+        <w:t>Actualizar la información mostrada.</w:t>
+      </w:r>
+    </w:p>
+    <w:p>
+      <w:pPr>
+        <w:numPr>
+          <w:ilvl w:val="0"/>
+          <w:numId w:val="6"/>
+        </w:numPr>
+        <w:rPr>
+          <w:rFonts w:ascii="Arial" w:hAnsi="Arial" w:cs="Arial"/>
+        </w:rPr>
+      </w:pPr>
+      <w:r>
+        <w:rPr>
+          <w:rFonts w:ascii="Arial" w:hAnsi="Arial" w:cs="Arial"/>
+        </w:rPr>
+        <w:t>Seleccionar registros para realizar operaciones.</w:t>
+      </w:r>
+    </w:p>
+    <w:p>
+      <w:pPr>
+        <w:numPr>
+          <w:ilvl w:val="0"/>
+          <w:numId w:val="6"/>
+        </w:numPr>
+        <w:rPr>
+          <w:rFonts w:ascii="Arial" w:hAnsi="Arial" w:cs="Arial"/>
+        </w:rPr>
+      </w:pPr>
+      <w:r>
+        <w:rPr>
+          <w:rFonts w:ascii="Arial" w:hAnsi="Arial" w:cs="Arial"/>
+        </w:rPr>
+        <w:t>Manejar posibles errores durante las operaciones.</w:t>
+      </w:r>
+    </w:p>
+    <w:p>
+      <w:pPr>
+        <w:rPr>
+          <w:rFonts w:ascii="Arial" w:hAnsi="Arial" w:cs="Arial"/>
+        </w:rPr>
+      </w:pPr>
+      <w:r>
+        <w:rPr>
+          <w:rFonts w:ascii="Arial" w:hAnsi="Arial" w:cs="Arial"/>
+        </w:rPr>
+        <w:t>También se comenzó a implementar la búsqueda en memoria, permitiendo filtrar los clientes que ya fueron cargados en la aplicación.</w:t>
+      </w:r>
+    </w:p>
+    <w:p>
+      <w:pPr>
+        <w:rPr>
+          <w:rFonts w:ascii="Arial" w:hAnsi="Arial" w:cs="Arial"/>
+          <w:b/>
+          <w:bCs/>
+        </w:rPr>
+      </w:pPr>
+      <w:r>
+        <w:rPr>
+          <w:rFonts w:ascii="Arial" w:hAnsi="Arial" w:cs="Arial"/>
+          <w:b/>
+          <w:bCs/>
+        </w:rPr>
+        <w:t>Implementación de MVVM</w:t>
+      </w:r>
+    </w:p>
+    <w:p>
+      <w:pPr>
+        <w:rPr>
+          <w:rFonts w:ascii="Arial" w:hAnsi="Arial" w:cs="Arial"/>
+        </w:rPr>
+      </w:pPr>
+      <w:r>
+        <w:rPr>
+          <w:rFonts w:ascii="Arial" w:hAnsi="Arial" w:cs="Arial"/>
+        </w:rPr>
+        <w:lastRenderedPageBreak/>
+        <w:t>Uno de los aspectos importantes del proyecto es la utilización del patrón MVVM.</w:t>
+      </w:r>
+    </w:p>
+    <w:p>
+      <w:pPr>
+        <w:rPr>
+          <w:rFonts w:ascii="Arial" w:hAnsi="Arial" w:cs="Arial"/>
+        </w:rPr>
+      </w:pPr>
+      <w:r>
+        <w:rPr>
+          <w:rFonts w:ascii="Arial" w:hAnsi="Arial" w:cs="Arial"/>
+        </w:rPr>
+        <w:t>La comunicación entre las diferentes partes del sistema sigue una estructura similar a:</w:t>
+      </w:r>
+    </w:p>
+    <w:p>
+      <w:pPr>
+        <w:rPr>
+          <w:rFonts w:ascii="Arial" w:hAnsi="Arial" w:cs="Arial"/>
+        </w:rPr>
+      </w:pPr>
+      <w:r>
+        <w:rPr>
+          <w:rFonts w:ascii="Arial" w:hAnsi="Arial" w:cs="Arial"/>
+        </w:rPr>
+        <w:t>Usuario</w:t>
+      </w:r>
+    </w:p>
+    <w:p>
+      <w:pPr>
+        <w:rPr>
+          <w:rFonts w:ascii="Arial" w:hAnsi="Arial" w:cs="Arial"/>
+        </w:rPr>
+      </w:pPr>
+      <w:r>
+        <w:rPr>
+          <w:rFonts w:ascii="Arial" w:hAnsi="Arial" w:cs="Arial"/>
+        </w:rPr>
+        <w:t xml:space="preserve">   ↓</w:t>
+      </w:r>
+    </w:p>
+    <w:p>
+      <w:pPr>
+        <w:rPr>
+          <w:rFonts w:ascii="Arial" w:hAnsi="Arial" w:cs="Arial"/>
+        </w:rPr>
+      </w:pPr>
+      <w:proofErr w:type="spellStart"/>
+      <w:r>
+        <w:rPr>
+          <w:rFonts w:ascii="Arial" w:hAnsi="Arial" w:cs="Arial"/>
+        </w:rPr>
+        <w:t>ClientesView.xaml</w:t>
+      </w:r>
+      <w:proofErr w:type="spellEnd"/>
+    </w:p>
+    <w:p>
+      <w:pPr>
+        <w:rPr>
+          <w:rFonts w:ascii="Arial" w:hAnsi="Arial" w:cs="Arial"/>
+        </w:rPr>
+      </w:pPr>
+      <w:r>
+        <w:rPr>
+          <w:rFonts w:ascii="Arial" w:hAnsi="Arial" w:cs="Arial"/>
+        </w:rPr>
+        <w:t xml:space="preserve">   ↓</w:t>
+      </w:r>
+    </w:p>
+    <w:p>
+      <w:pPr>
+        <w:rPr>
+          <w:rFonts w:ascii="Arial" w:hAnsi="Arial" w:cs="Arial"/>
+        </w:rPr>
+      </w:pPr>
+      <w:proofErr w:type="spellStart"/>
+      <w:r>
+        <w:rPr>
+          <w:rFonts w:ascii="Arial" w:hAnsi="Arial" w:cs="Arial"/>
+        </w:rPr>
+        <w:t>ClienteViewModel</w:t>
+      </w:r>
+      <w:proofErr w:type="spellEnd"/>
+    </w:p>
+    <w:p>
+      <w:pPr>
+        <w:rPr>
+          <w:rFonts w:ascii="Arial" w:hAnsi="Arial" w:cs="Arial"/>
+        </w:rPr>
+      </w:pPr>
+      <w:r>
+        <w:rPr>
+          <w:rFonts w:ascii="Arial" w:hAnsi="Arial" w:cs="Arial"/>
+        </w:rPr>
+        <w:t xml:space="preserve">   ↓</w:t>
+      </w:r>
+    </w:p>
+    <w:p>
+      <w:pPr>
+        <w:rPr>
+          <w:rFonts w:ascii="Arial" w:hAnsi="Arial" w:cs="Arial"/>
+        </w:rPr>
+      </w:pPr>
+      <w:proofErr w:type="spellStart"/>
+      <w:r>
+        <w:rPr>
+          <w:rFonts w:ascii="Arial" w:hAnsi="Arial" w:cs="Arial"/>
+        </w:rPr>
+        <w:t>ClienteService</w:t>
+      </w:r>
+      <w:proofErr w:type="spellEnd"/>
+    </w:p>
+    <w:p>
+      <w:pPr>
+        <w:rPr>
+          <w:rFonts w:ascii="Arial" w:hAnsi="Arial" w:cs="Arial"/>
+        </w:rPr>
+      </w:pPr>
+      <w:r>
+        <w:rPr>
+          <w:rFonts w:ascii="Arial" w:hAnsi="Arial" w:cs="Arial"/>
+        </w:rPr>
+        <w:t xml:space="preserve">   ↓</w:t>
+      </w:r>
+    </w:p>
+    <w:p>
+      <w:pPr>
+        <w:rPr>
+          <w:rFonts w:ascii="Arial" w:hAnsi="Arial" w:cs="Arial"/>
+        </w:rPr>
+      </w:pPr>
+      <w:r>
+        <w:rPr>
+          <w:rFonts w:ascii="Arial" w:hAnsi="Arial" w:cs="Arial"/>
+        </w:rPr>
+        <w:t>Base de datos</w:t>
+      </w:r>
+    </w:p>
+    <w:p>
+      <w:pPr>
+        <w:rPr>
+          <w:rFonts w:ascii="Arial" w:hAnsi="Arial" w:cs="Arial"/>
+        </w:rPr>
+      </w:pPr>
+      <w:r>
+        <w:rPr>
+          <w:rFonts w:ascii="Arial" w:hAnsi="Arial" w:cs="Arial"/>
+        </w:rPr>
+        <w:t>Esto permite mantener separada la interfaz gráfica de la lógica de negocio y del acceso a los datos.</w:t>
+      </w:r>
+    </w:p>
+    <w:p>
+      <w:pPr>
+        <w:rPr>
+          <w:rFonts w:ascii="Arial" w:hAnsi="Arial" w:cs="Arial"/>
+        </w:rPr>
+      </w:pPr>
+      <w:r>
+        <w:rPr>
+          <w:rFonts w:ascii="Arial" w:hAnsi="Arial" w:cs="Arial"/>
+        </w:rPr>
+        <w:t xml:space="preserve">También se comenzó a utilizar </w:t>
+      </w:r>
+      <w:proofErr w:type="spellStart"/>
+      <w:r>
+        <w:rPr>
+          <w:rFonts w:ascii="Arial" w:hAnsi="Arial" w:cs="Arial"/>
+        </w:rPr>
+        <w:t>ICommand</w:t>
+      </w:r>
+      <w:proofErr w:type="spellEnd"/>
+      <w:r>
+        <w:rPr>
+          <w:rFonts w:ascii="Arial" w:hAnsi="Arial" w:cs="Arial"/>
+        </w:rPr>
+        <w:t xml:space="preserve"> para manejar las acciones de los botones desde el </w:t>
+      </w:r>
+      <w:proofErr w:type="spellStart"/>
+      <w:r>
+        <w:rPr>
+          <w:rFonts w:ascii="Arial" w:hAnsi="Arial" w:cs="Arial"/>
+        </w:rPr>
+        <w:t>ViewModel</w:t>
+      </w:r>
+      <w:proofErr w:type="spellEnd"/>
+      <w:r>
+        <w:rPr>
+          <w:rFonts w:ascii="Arial" w:hAnsi="Arial" w:cs="Arial"/>
+        </w:rPr>
+        <w:t>, evitando depender directamente de eventos en la interfaz.</w:t>
+      </w:r>
+    </w:p>
+    <w:p>
+      <w:pPr>
+        <w:rPr>
+          <w:rFonts w:ascii="Arial" w:hAnsi="Arial" w:cs="Arial"/>
+          <w:b/>
+          <w:bCs/>
+        </w:rPr>
+      </w:pPr>
+      <w:r>
+        <w:rPr>
+          <w:rFonts w:ascii="Arial" w:hAnsi="Arial" w:cs="Arial"/>
+          <w:b/>
+          <w:bCs/>
+        </w:rPr>
+        <w:t>Manejo de errores</w:t>
+      </w:r>
+    </w:p>
+    <w:p>
+      <w:pPr>
+        <w:rPr>
+          <w:rFonts w:ascii="Arial" w:hAnsi="Arial" w:cs="Arial"/>
+        </w:rPr>
+      </w:pPr>
+      <w:r>
+        <w:rPr>
+          <w:rFonts w:ascii="Arial" w:hAnsi="Arial" w:cs="Arial"/>
+        </w:rPr>
+        <w:t>Se incorporó el manejo de excepciones para evitar que errores durante las operaciones con la base de datos provoquen el cierre inesperado de la aplicación.</w:t>
+      </w:r>
+    </w:p>
+    <w:p>
+      <w:pPr>
+        <w:rPr>
+          <w:rFonts w:ascii="Arial" w:hAnsi="Arial" w:cs="Arial"/>
+        </w:rPr>
+      </w:pPr>
+      <w:r>
+        <w:rPr>
+          <w:rFonts w:ascii="Arial" w:hAnsi="Arial" w:cs="Arial"/>
+        </w:rPr>
+        <w:t>Esto permite que el sistema pueda informar adecuadamente cuando ocurre un problema durante acciones como guardar, modificar, eliminar o consultar información.</w:t>
+      </w:r>
+    </w:p>
+    <w:p>
+      <w:pPr>
+        <w:rPr>
+          <w:rFonts w:ascii="Arial" w:hAnsi="Arial" w:cs="Arial"/>
+        </w:rPr>
+      </w:pPr>
+      <w:r>
+        <w:rPr>
+          <w:rFonts w:ascii="Arial" w:hAnsi="Arial" w:cs="Arial"/>
+          <w:noProof/>
+        </w:rPr>
+        <w:lastRenderedPageBreak/>
+        <w:drawing>
+          <wp:inline distT="0" distB="0" distL="0" distR="0" wp14:anchorId="02373573" wp14:editId="7C904A90">
+            <wp:extent cx="5129525" cy="2967892"/>
+            <wp:effectExtent l="0" t="0" r="0" b="4445"/>
+            <wp:docPr id="729103588" name="Imagen 2"/>
+            <wp:cNvGraphicFramePr>
+              <a:graphicFrameLocks xmlns:a="http://schemas.openxmlformats.org/drawingml/2006/main" noChangeAspect="1"/>
+            </wp:cNvGraphicFramePr>
+            <a:graphic xmlns:a="http://schemas.openxmlformats.org/drawingml/2006/main">
+              <a:graphicData uri="http://schemas.openxmlformats.org/drawingml/2006/picture">
+                <pic:pic xmlns:pic="http://schemas.openxmlformats.org/drawingml/2006/picture">
+                  <pic:nvPicPr>
+                    <pic:cNvPr id="0" name="Picture 2"/>
+                    <pic:cNvPicPr>
+                      <a:picLocks noChangeAspect="1" noChangeArrowheads="1"/>
+                    </pic:cNvPicPr>
+                  </pic:nvPicPr>
+                  <pic:blipFill>
+                    <a:blip r:embed="rId7" cstate="print">
+                      <a:extLst>
+                        <a:ext uri="{28A0092B-C50C-407E-A947-70E740481C1C}">
+                          <a14:useLocalDpi xmlns:a14="http://schemas.microsoft.com/office/drawing/2010/main" val="0"/>
+                        </a:ext>
+                      </a:extLst>
+                    </a:blip>
+                    <a:srcRect/>
+                    <a:stretch>
+                      <a:fillRect/>
+                    </a:stretch>
+                  </pic:blipFill>
+                  <pic:spPr bwMode="auto">
+                    <a:xfrm>
+                      <a:off x="0" y="0"/>
+                      <a:ext cx="5157092" cy="2983842"/>
+                    </a:xfrm>
+                    <a:prstGeom prst="rect">
+                      <a:avLst/>
+                    </a:prstGeom>
+                    <a:noFill/>
+                  </pic:spPr>
+                </pic:pic>
+              </a:graphicData>
+            </a:graphic>
+          </wp:inline>
+        </w:drawing>
+      </w:r>
+    </w:p>
+    <w:p>
+      <w:pPr>
+        <w:rPr>
+          <w:rFonts w:ascii="Arial" w:hAnsi="Arial" w:cs="Arial"/>
+        </w:rPr>
+      </w:pPr>
+    </w:p>
+    <w:p>
+      <w:pPr>
+        <w:rPr>
+          <w:rFonts w:ascii="Arial" w:hAnsi="Arial" w:cs="Arial"/>
+          <w:b/>
+          <w:bCs/>
+        </w:rPr>
+      </w:pPr>
+    </w:p>
+    <w:p>
+      <w:pPr>
+        <w:rPr>
+          <w:rFonts w:ascii="Arial" w:hAnsi="Arial" w:cs="Arial"/>
+          <w:b/>
+          <w:bCs/>
+        </w:rPr>
+      </w:pPr>
+      <w:r>
+        <w:rPr>
+          <w:rFonts w:ascii="Arial" w:hAnsi="Arial" w:cs="Arial"/>
+          <w:b/>
+          <w:bCs/>
+        </w:rPr>
+        <w:t>Resultado</w:t>
+      </w:r>
+    </w:p>
+    <w:p>
+      <w:pPr>
+        <w:rPr>
+          <w:rFonts w:ascii="Arial" w:hAnsi="Arial" w:cs="Arial"/>
+        </w:rPr>
+      </w:pPr>
+      <w:r>
+        <w:rPr>
+          <w:rFonts w:ascii="Arial" w:hAnsi="Arial" w:cs="Arial"/>
+        </w:rPr>
+        <w:t>Como resultado del trabajo realizado, TallerPro cuenta con una estructura organizada para comenzar el desarrollo funcional del sistema.</w:t>
+      </w:r>
+    </w:p>
+    <w:p>
+      <w:pPr>
+        <w:rPr>
+          <w:rFonts w:ascii="Arial" w:hAnsi="Arial" w:cs="Arial"/>
+        </w:rPr>
+      </w:pPr>
+      <w:r>
+        <w:rPr>
+          <w:rFonts w:ascii="Arial" w:hAnsi="Arial" w:cs="Arial"/>
+        </w:rPr>
+        <w:t>El módulo de clientes dispone de una base preparada para realizar las operaciones principales de administración de información, utilizando una arquitectura que facilita el mantenimiento y la incorporación de nuevas funcionalidades.</w:t>
       </w:r>
     </w:p>
     <w:p/>
@@ -1863,6 +3043,155 @@
     </w:lvl>
   </w:abstractNum>
   <w:abstractNum w:abstractNumId="3" w15:restartNumberingAfterBreak="0">
+    <w:nsid w:val="32EE0D29"/>
+    <w:multiLevelType w:val="multilevel"/>
+    <w:tmpl w:val="174C3EE2"/>
+    <w:lvl w:ilvl="0">
+      <w:start w:val="1"/>
+      <w:numFmt w:val="bullet"/>
+      <w:lvlText w:val=""/>
+      <w:lvlJc w:val="left"/>
+      <w:pPr>
+        <w:tabs>
+          <w:tab w:val="num" w:pos="720"/>
+        </w:tabs>
+        <w:ind w:left="720" w:hanging="360"/>
+      </w:pPr>
+      <w:rPr>
+        <w:rFonts w:ascii="Symbol" w:hAnsi="Symbol" w:hint="default"/>
+        <w:sz w:val="20"/>
+      </w:rPr>
+    </w:lvl>
+    <w:lvl w:ilvl="1" w:tentative="1">
+      <w:start w:val="1"/>
+      <w:numFmt w:val="bullet"/>
+      <w:lvlText w:val="o"/>
+      <w:lvlJc w:val="left"/>
+      <w:pPr>
+        <w:tabs>
+          <w:tab w:val="num" w:pos="1440"/>
+        </w:tabs>
+        <w:ind w:left="1440" w:hanging="360"/>
+      </w:pPr>
+      <w:rPr>
+        <w:rFonts w:ascii="Courier New" w:hAnsi="Courier New" w:hint="default"/>
+        <w:sz w:val="20"/>
+      </w:rPr>
+    </w:lvl>
+    <w:lvl w:ilvl="2" w:tentative="1">
+      <w:start w:val="1"/>
+      <w:numFmt w:val="bullet"/>
+      <w:lvlText w:val=""/>
+      <w:lvlJc w:val="left"/>
+      <w:pPr>
+        <w:tabs>
+          <w:tab w:val="num" w:pos="2160"/>
+        </w:tabs>
+        <w:ind w:left="2160" w:hanging="360"/>
+      </w:pPr>
+      <w:rPr>
+        <w:rFonts w:ascii="Wingdings" w:hAnsi="Wingdings" w:hint="default"/>
+        <w:sz w:val="20"/>
+      </w:rPr>
+    </w:lvl>
+    <w:lvl w:ilvl="3" w:tentative="1">
+      <w:start w:val="1"/>
+      <w:numFmt w:val="bullet"/>
+      <w:lvlText w:val=""/>
+      <w:lvlJc w:val="left"/>
+      <w:pPr>
+        <w:tabs>
+          <w:tab w:val="num" w:pos="2880"/>
+        </w:tabs>
+        <w:ind w:left="2880" w:hanging="360"/>
+      </w:pPr>
+      <w:rPr>
+        <w:rFonts w:ascii="Wingdings" w:hAnsi="Wingdings" w:hint="default"/>
+        <w:sz w:val="20"/>
+      </w:rPr>
+    </w:lvl>
+    <w:lvl w:ilvl="4" w:tentative="1">
+      <w:start w:val="1"/>
+      <w:numFmt w:val="bullet"/>
+      <w:lvlText w:val=""/>
+      <w:lvlJc w:val="left"/>
+      <w:pPr>
+        <w:tabs>
+          <w:tab w:val="num" w:pos="3600"/>
+        </w:tabs>
+        <w:ind w:left="3600" w:hanging="360"/>
+      </w:pPr>
+      <w:rPr>
+        <w:rFonts w:ascii="Wingdings" w:hAnsi="Wingdings" w:hint="default"/>
+        <w:sz w:val="20"/>
+      </w:rPr>
+    </w:lvl>
+    <w:lvl w:ilvl="5" w:tentative="1">
+      <w:start w:val="1"/>
+      <w:numFmt w:val="bullet"/>
+      <w:lvlText w:val=""/>
+      <w:lvlJc w:val="left"/>
+      <w:pPr>
+        <w:tabs>
+          <w:tab w:val="num" w:pos="4320"/>
+        </w:tabs>
+        <w:ind w:left="4320" w:hanging="360"/>
+      </w:pPr>
+      <w:rPr>
+        <w:rFonts w:ascii="Wingdings" w:hAnsi="Wingdings" w:hint="default"/>
+        <w:sz w:val="20"/>
+      </w:rPr>
+    </w:lvl>
+    <w:lvl w:ilvl="6" w:tentative="1">
+      <w:start w:val="1"/>
+      <w:numFmt w:val="bullet"/>
+      <w:lvlText w:val=""/>
+      <w:lvlJc w:val="left"/>
+      <w:pPr>
+        <w:tabs>
+          <w:tab w:val="num" w:pos="5040"/>
+        </w:tabs>
+        <w:ind w:left="5040" w:hanging="360"/>
+      </w:pPr>
+      <w:rPr>
+        <w:rFonts w:ascii="Wingdings" w:hAnsi="Wingdings" w:hint="default"/>
+        <w:sz w:val="20"/>
+      </w:rPr>
+    </w:lvl>
+    <w:lvl w:ilvl="7" w:tentative="1">
+      <w:start w:val="1"/>
+      <w:numFmt w:val="bullet"/>
+      <w:lvlText w:val=""/>
+      <w:lvlJc w:val="left"/>
+      <w:pPr>
+        <w:tabs>
+          <w:tab w:val="num" w:pos="5760"/>
+        </w:tabs>
+        <w:ind w:left="5760" w:hanging="360"/>
+      </w:pPr>
+      <w:rPr>
+        <w:rFonts w:ascii="Wingdings" w:hAnsi="Wingdings" w:hint="default"/>
+        <w:sz w:val="20"/>
+      </w:rPr>
+    </w:lvl>
+    <w:lvl w:ilvl="8" w:tentative="1">
+      <w:start w:val="1"/>
+      <w:numFmt w:val="bullet"/>
+      <w:lvlText w:val=""/>
+      <w:lvlJc w:val="left"/>
+      <w:pPr>
+        <w:tabs>
+          <w:tab w:val="num" w:pos="6480"/>
+        </w:tabs>
+        <w:ind w:left="6480" w:hanging="360"/>
+      </w:pPr>
+      <w:rPr>
+        <w:rFonts w:ascii="Wingdings" w:hAnsi="Wingdings" w:hint="default"/>
+        <w:sz w:val="20"/>
+      </w:rPr>
+    </w:lvl>
+  </w:abstractNum>
+  <w:abstractNum w:abstractNumId="4" w15:restartNumberingAfterBreak="0">
     <w:nsid w:val="6307535E"/>
     <w:multiLevelType w:val="hybridMultilevel"/>
     <w:tmpl w:val="E4A8AD40"/>
@@ -1951,7 +3280,7 @@
       </w:pPr>
     </w:lvl>
   </w:abstractNum>
-  <w:abstractNum w:abstractNumId="4" w15:restartNumberingAfterBreak="0">
+  <w:abstractNum w:abstractNumId="5" w15:restartNumberingAfterBreak="0">
     <w:nsid w:val="7A43266D"/>
     <w:multiLevelType w:val="multilevel"/>
     <w:tmpl w:val="B0CE3E14"/>
@@ -2104,7 +3433,7 @@
     <w:abstractNumId w:val="0"/>
   </w:num>
   <w:num w:numId="2" w16cid:durableId="1790736429">
-    <w:abstractNumId w:val="4"/>
+    <w:abstractNumId w:val="5"/>
   </w:num>
   <w:num w:numId="3" w16cid:durableId="993410813">
     <w:abstractNumId w:val="1"/>
@@ -2113,6 +3442,9 @@
     <w:abstractNumId w:val="2"/>
   </w:num>
   <w:num w:numId="5" w16cid:durableId="1984039205">
+    <w:abstractNumId w:val="4"/>
+  </w:num>
+  <w:num w:numId="6" w16cid:durableId="1939409503">
     <w:abstractNumId w:val="3"/>
   </w:num>
 </w:numbering>
@@ -2518,7 +3850,7 @@
   <w:style w:type="paragraph" w:default="1" w:styleId="Normal">
     <w:name w:val="Normal"/>
     <w:qFormat/>
-    <w:rsid w:val="001B2CF0"/>
+    <w:rsid w:val="00480E0F"/>
   </w:style>
   <w:style w:type="paragraph" w:styleId="Ttulo1">
     <w:name w:val="heading 1"/>

</xml_diff>